<commit_message>
add execution screenshots to report
</commit_message>
<xml_diff>
--- a/b11402037-b11402053-report.docx
+++ b/b11402037-b11402053-report.docx
@@ -2092,7 +2092,119 @@
           <w:color w:val="22303F"/>
           <w:sz w:val="22"/>
         </w:rPr>
-        <w:t>選單採同步複合動作設計：載入後立即顯示原始資料、正規化後立即顯示結果、匯出成功後自動離開程式。標準操作序列為 1 → 2 → 3，輸出檔為 data/samples/normalized_universities.csv。</w:t>
+        <w:t>選單採同步複合動作設計：載入後立即顯示原始資料、正規化後立即顯示結果、匯出成功後自動離開程式。標準操作序列為 1 → 2 → 3，輸出檔為 data/samples/normalized_universities.csv。以下為 Windows 環境的實際執行畫面：</w:t>
+      </w:r>
+    </w:p>
+    <w:p>
+      <w:pPr>
+        <w:spacing w:before="120"/>
+        <w:jc w:val="center"/>
+      </w:pPr>
+      <w:r>
+        <w:drawing>
+          <wp:inline xmlns:a="http://schemas.openxmlformats.org/drawingml/2006/main" xmlns:pic="http://schemas.openxmlformats.org/drawingml/2006/picture">
+            <wp:extent cx="5724000" cy="3040875"/>
+            <wp:docPr id="1" name="Picture 1"/>
+            <wp:cNvGraphicFramePr>
+              <a:graphicFrameLocks noChangeAspect="1"/>
+            </wp:cNvGraphicFramePr>
+            <a:graphic>
+              <a:graphicData uri="http://schemas.openxmlformats.org/drawingml/2006/picture">
+                <pic:pic>
+                  <pic:nvPicPr>
+                    <pic:cNvPr id="0" name="run-build-load.png"/>
+                    <pic:cNvPicPr/>
+                  </pic:nvPicPr>
+                  <pic:blipFill>
+                    <a:blip r:embed="rId10"/>
+                    <a:stretch>
+                      <a:fillRect/>
+                    </a:stretch>
+                  </pic:blipFill>
+                  <pic:spPr>
+                    <a:xfrm>
+                      <a:off x="0" y="0"/>
+                      <a:ext cx="5724000" cy="3040875"/>
+                    </a:xfrm>
+                    <a:prstGeom prst="rect"/>
+                  </pic:spPr>
+                </pic:pic>
+              </a:graphicData>
+            </a:graphic>
+          </wp:inline>
+        </w:drawing>
+      </w:r>
+    </w:p>
+    <w:p>
+      <w:pPr>
+        <w:spacing w:after="200"/>
+        <w:jc w:val="center"/>
+      </w:pPr>
+      <w:r>
+        <w:rPr>
+          <w:rFonts w:ascii="Microsoft JhengHei" w:hAnsi="Microsoft JhengHei" w:eastAsia="Microsoft JhengHei"/>
+          <w:b w:val="0"/>
+          <w:i w:val="0"/>
+          <w:color w:val="5F6E7D"/>
+          <w:sz w:val="20"/>
+        </w:rPr>
+        <w:t>圖 1：以 build.ps1 編譯（同步清空舊輸出）後執行，選項 1 載入 CSV 並顯示原始資料</w:t>
+      </w:r>
+    </w:p>
+    <w:p>
+      <w:pPr>
+        <w:spacing w:before="120"/>
+        <w:jc w:val="center"/>
+      </w:pPr>
+      <w:r>
+        <w:drawing>
+          <wp:inline xmlns:a="http://schemas.openxmlformats.org/drawingml/2006/main" xmlns:pic="http://schemas.openxmlformats.org/drawingml/2006/picture">
+            <wp:extent cx="5724000" cy="3040875"/>
+            <wp:docPr id="2" name="Picture 2"/>
+            <wp:cNvGraphicFramePr>
+              <a:graphicFrameLocks noChangeAspect="1"/>
+            </wp:cNvGraphicFramePr>
+            <a:graphic>
+              <a:graphicData uri="http://schemas.openxmlformats.org/drawingml/2006/picture">
+                <pic:pic>
+                  <pic:nvPicPr>
+                    <pic:cNvPr id="0" name="run-normalize-export.png"/>
+                    <pic:cNvPicPr/>
+                  </pic:nvPicPr>
+                  <pic:blipFill>
+                    <a:blip r:embed="rId11"/>
+                    <a:stretch>
+                      <a:fillRect/>
+                    </a:stretch>
+                  </pic:blipFill>
+                  <pic:spPr>
+                    <a:xfrm>
+                      <a:off x="0" y="0"/>
+                      <a:ext cx="5724000" cy="3040875"/>
+                    </a:xfrm>
+                    <a:prstGeom prst="rect"/>
+                  </pic:spPr>
+                </pic:pic>
+              </a:graphicData>
+            </a:graphic>
+          </wp:inline>
+        </w:drawing>
+      </w:r>
+    </w:p>
+    <w:p>
+      <w:pPr>
+        <w:spacing w:after="200"/>
+        <w:jc w:val="center"/>
+      </w:pPr>
+      <w:r>
+        <w:rPr>
+          <w:rFonts w:ascii="Microsoft JhengHei" w:hAnsi="Microsoft JhengHei" w:eastAsia="Microsoft JhengHei"/>
+          <w:b w:val="0"/>
+          <w:i w:val="0"/>
+          <w:color w:val="5F6E7D"/>
+          <w:sz w:val="20"/>
+        </w:rPr>
+        <w:t>圖 2：選項 2 正規化並顯示結果，選項 3 匯出 CSV 後自動離開程式</w:t>
       </w:r>
     </w:p>
     <w:p>

</xml_diff>